<commit_message>
Added ABAC INDUSTRY web site
</commit_message>
<xml_diff>
--- a/1_Project_Description/Project_Description.docx
+++ b/1_Project_Description/Project_Description.docx
@@ -1094,9 +1094,9 @@
         <w:lastRenderedPageBreak/>
         <w:drawing>
           <wp:inline distT="0" distB="0" distL="0" distR="0">
-            <wp:extent cx="5760720" cy="4011311"/>
+            <wp:extent cx="5753100" cy="3762375"/>
             <wp:effectExtent l="19050" t="0" r="0" b="0"/>
-            <wp:docPr id="9" name="Image 9" descr="C:\Users\dell\Downloads\RADAR_V6.jpg"/>
+            <wp:docPr id="3" name="Image 12"/>
             <wp:cNvGraphicFramePr>
               <a:graphicFrameLocks xmlns:a="http://schemas.openxmlformats.org/drawingml/2006/main" noChangeAspect="1"/>
             </wp:cNvGraphicFramePr>
@@ -1104,7 +1104,7 @@
               <a:graphicData uri="http://schemas.openxmlformats.org/drawingml/2006/picture">
                 <pic:pic xmlns:pic="http://schemas.openxmlformats.org/drawingml/2006/picture">
                   <pic:nvPicPr>
-                    <pic:cNvPr id="0" name="Picture 9" descr="C:\Users\dell\Downloads\RADAR_V6.jpg"/>
+                    <pic:cNvPr id="0" name="Picture 12"/>
                     <pic:cNvPicPr>
                       <a:picLocks noChangeAspect="1" noChangeArrowheads="1"/>
                     </pic:cNvPicPr>
@@ -1119,7 +1119,7 @@
                   <pic:spPr bwMode="auto">
                     <a:xfrm>
                       <a:off x="0" y="0"/>
-                      <a:ext cx="5760720" cy="4011311"/>
+                      <a:ext cx="5753100" cy="3762375"/>
                     </a:xfrm>
                     <a:prstGeom prst="rect">
                       <a:avLst/>
@@ -1351,17 +1351,7 @@
           <w:color w:val="0F1115"/>
           <w:lang w:val="en-US"/>
         </w:rPr>
-        <w:t xml:space="preserve">three </w:t>
-      </w:r>
-      <w:r>
-        <w:rPr>
-          <w:rStyle w:val="lev"/>
-          <w:rFonts w:asciiTheme="minorHAnsi" w:hAnsiTheme="minorHAnsi" w:cs="Segoe UI"/>
-          <w:color w:val="0F1115"/>
-          <w:lang w:val="en-US"/>
-        </w:rPr>
-        <w:lastRenderedPageBreak/>
-        <w:t>minutes</w:t>
+        <w:t>three minutes</w:t>
       </w:r>
       <w:r>
         <w:rPr>
@@ -1389,6 +1379,7 @@
           <w:color w:val="0F1115"/>
           <w:lang w:val="en-US"/>
         </w:rPr>
+        <w:lastRenderedPageBreak/>
         <w:t>Once the OCXO is stable, the STM32 manages </w:t>
       </w:r>
       <w:r>
@@ -1968,6 +1959,7 @@
           <w:color w:val="0F1115"/>
           <w:lang w:val="en-US"/>
         </w:rPr>
+        <w:lastRenderedPageBreak/>
         <w:t>Attitude Determination and Mechanical Alignment</w:t>
       </w:r>
     </w:p>
@@ -2453,6 +2445,7 @@
           <w:color w:val="0F1115"/>
           <w:lang w:val="en-US"/>
         </w:rPr>
+        <w:lastRenderedPageBreak/>
         <w:t>n</w:t>
       </w:r>
       <w:r>
@@ -3204,7 +3197,6 @@
         </w:rPr>
       </w:pPr>
       <w:r>
-        <w:lastRenderedPageBreak/>
         <w:pict>
           <v:rect id="_x0000_i1033" style="width:0;height:.75pt" o:hralign="center" o:hrstd="t" o:hrnoshade="t" o:hr="t" fillcolor="#0f1115" stroked="f"/>
         </w:pict>
@@ -3326,6 +3318,7 @@
           <w:rFonts w:asciiTheme="minorHAnsi" w:hAnsiTheme="minorHAnsi" w:cs="Segoe UI"/>
           <w:color w:val="0F1115"/>
         </w:rPr>
+        <w:lastRenderedPageBreak/>
         <w:t>m resets to 1</w:t>
       </w:r>
     </w:p>
@@ -3779,6 +3772,27 @@
     <w:p>
       <w:pPr>
         <w:rPr>
+          <w:lang w:val="en-US"/>
+        </w:rPr>
+      </w:pPr>
+    </w:p>
+    <w:p>
+      <w:pPr>
+        <w:rPr>
+          <w:lang w:val="en-US"/>
+        </w:rPr>
+      </w:pPr>
+    </w:p>
+    <w:p>
+      <w:pPr>
+        <w:rPr>
+          <w:lang w:val="en-US"/>
+        </w:rPr>
+      </w:pPr>
+    </w:p>
+    <w:p>
+      <w:pPr>
+        <w:rPr>
           <w:b/>
           <w:bCs/>
           <w:sz w:val="27"/>
@@ -3792,6 +3806,7 @@
           <w:sz w:val="27"/>
           <w:szCs w:val="27"/>
         </w:rPr>
+        <w:lastRenderedPageBreak/>
         <w:t>What's Working:</w:t>
       </w:r>
     </w:p>
@@ -4273,16 +4288,74 @@
       <w:pPr>
         <w:spacing w:before="240" w:after="100" w:afterAutospacing="1" w:line="240" w:lineRule="auto"/>
         <w:rPr>
+          <w:rFonts w:ascii="Segoe UI" w:hAnsi="Segoe UI" w:cs="Segoe UI"/>
+          <w:color w:val="0F1115"/>
+          <w:lang w:val="en-US"/>
+        </w:rPr>
+      </w:pPr>
+      <w:r>
+        <w:rPr>
+          <w:rStyle w:val="lev"/>
+          <w:rFonts w:ascii="Segoe UI" w:hAnsi="Segoe UI" w:cs="Segoe UI"/>
+          <w:color w:val="0F1115"/>
+          <w:lang w:val="en-US"/>
+        </w:rPr>
+        <w:t>Project Link:</w:t>
+      </w:r>
+      <w:r>
+        <w:rPr>
+          <w:rFonts w:ascii="Segoe UI" w:hAnsi="Segoe UI" w:cs="Segoe UI"/>
+          <w:color w:val="0F1115"/>
+          <w:lang w:val="en-US"/>
+        </w:rPr>
+        <w:t> </w:t>
+      </w:r>
+      <w:hyperlink r:id="rId10" w:tgtFrame="_blank" w:history="1">
+        <w:r>
+          <w:rPr>
+            <w:rStyle w:val="Lienhypertexte"/>
+            <w:rFonts w:ascii="Segoe UI" w:hAnsi="Segoe UI" w:cs="Segoe UI"/>
+            <w:lang w:val="en-US"/>
+          </w:rPr>
+          <w:t>https://hackaday.io/project/205190-open-source-plfm-radar-up-to-20km-range</w:t>
+        </w:r>
+      </w:hyperlink>
+    </w:p>
+    <w:p>
+      <w:pPr>
+        <w:spacing w:before="240" w:after="100" w:afterAutospacing="1" w:line="240" w:lineRule="auto"/>
+        <w:rPr>
           <w:rFonts w:eastAsia="Times New Roman" w:cs="Times New Roman"/>
           <w:sz w:val="24"/>
           <w:szCs w:val="24"/>
           <w:lang w:val="en-US"/>
         </w:rPr>
       </w:pPr>
+      <w:hyperlink r:id="rId11" w:history="1">
+        <w:r>
+          <w:rPr>
+            <w:rStyle w:val="Lienhypertexte"/>
+            <w:rFonts w:eastAsia="Times New Roman" w:cs="Times New Roman"/>
+            <w:sz w:val="24"/>
+            <w:szCs w:val="24"/>
+            <w:lang w:val="en-US"/>
+          </w:rPr>
+          <w:t>http://www.github.com/NawfalMotii79/PLFM_RADAR</w:t>
+        </w:r>
+      </w:hyperlink>
+      <w:r>
+        <w:rPr>
+          <w:rFonts w:eastAsia="Times New Roman" w:cs="Times New Roman"/>
+          <w:sz w:val="24"/>
+          <w:szCs w:val="24"/>
+          <w:lang w:val="en-US"/>
+        </w:rPr>
+        <w:t xml:space="preserve">  </w:t>
+      </w:r>
     </w:p>
     <w:sectPr>
-      <w:headerReference w:type="default" r:id="rId10"/>
-      <w:footerReference w:type="default" r:id="rId11"/>
+      <w:headerReference w:type="default" r:id="rId12"/>
+      <w:footerReference w:type="default" r:id="rId13"/>
       <w:pgSz w:w="11906" w:h="16838"/>
       <w:pgMar w:top="1417" w:right="1417" w:bottom="1417" w:left="1417" w:header="113" w:footer="794" w:gutter="0"/>
       <w:cols w:space="708"/>
@@ -4378,6 +4451,10 @@
   <w:p>
     <w:pPr>
       <w:pStyle w:val="Pieddepage"/>
+      <w:tabs>
+        <w:tab w:val="clear" w:pos="9072"/>
+        <w:tab w:val="left" w:pos="4536"/>
+      </w:tabs>
       <w:ind w:left="-1020"/>
       <w:rPr>
         <w:sz w:val="20"/>
@@ -4412,6 +4489,43 @@
         <w:t>nawfal.motii.33@gmail.com</w:t>
       </w:r>
     </w:hyperlink>
+    <w:r>
+      <w:tab/>
+    </w:r>
+    <w:r>
+      <w:rPr>
+        <w:sz w:val="20"/>
+        <w:szCs w:val="20"/>
+      </w:rPr>
+      <w:t>web site</w:t>
+    </w:r>
+    <w:r>
+      <w:rPr>
+        <w:sz w:val="20"/>
+        <w:szCs w:val="20"/>
+      </w:rPr>
+      <w:t>:</w:t>
+    </w:r>
+    <w:r>
+      <w:rPr>
+        <w:sz w:val="20"/>
+        <w:szCs w:val="20"/>
+      </w:rPr>
+      <w:t xml:space="preserve"> </w:t>
+    </w:r>
+    <w:hyperlink r:id="rId2" w:history="1">
+      <w:r>
+        <w:rPr>
+          <w:rStyle w:val="Lienhypertexte"/>
+          <w:sz w:val="20"/>
+          <w:szCs w:val="20"/>
+        </w:rPr>
+        <w:t>www.abac-industry.com</w:t>
+      </w:r>
+    </w:hyperlink>
+    <w:r>
+      <w:t xml:space="preserve">  </w:t>
+    </w:r>
   </w:p>
 </w:ftr>
 </file>
@@ -4487,7 +4601,7 @@
                           <w:sz w:val="24"/>
                           <w:szCs w:val="24"/>
                         </w:rPr>
-                        <w:t>9</w:t>
+                        <w:t>1</w:t>
                       </w:r>
                     </w:fldSimple>
                   </w:p>

</xml_diff>